<commit_message>
Fix the search-strategy table in the Review 1 report
- Correct "A* (Manhattan)" in the comparison table's chosen row in the
  Markdown, Word and PDF versions
- Restore the architecture diagram in the Markdown version
</commit_message>
<xml_diff>
--- a/Wildfire Containment Squad — Review 1.docx
+++ b/Wildfire Containment Squad — Review 1.docx
@@ -3184,11 +3184,9 @@
               <w:rPr>
                 <w:i/>
               </w:rPr>
-              <w:t>A (Manhattan)</w:t>
-            </w:r>
-            <w:r>
-              <w:t>*</w:t>
-            </w:r>
+              <w:t>A* (Manhattan)</w:t>
+            </w:r>
+            <w:r/>
           </w:p>
         </w:tc>
         <w:tc>

</xml_diff>